<commit_message>
Fill in party names, addresses and representative in procurement contract
Co-Authored-By: Claude Sonnet 5.5 <noreply@anthropic.com>
Claude-Session: https://claude.ai/code/session_01KukB9Huw2zH7S2fSXwgxNH
</commit_message>
<xml_diff>
--- a/contracts/調達代行契約書_10Farm_10FF.docx
+++ b/contracts/調達代行契約書_10Farm_10FF.docx
@@ -26,7 +26,7 @@
         <w:rPr>
           <w:b w:val="0"/>
         </w:rPr>
-        <w:t>10 Farm（以下「甲」という。）と株式会社10FF（以下「乙」という。）は、甲が必要とする物品の調達に関し、乙が甲の依頼に基づき甲のために当該物品の購入を代行することについて、次のとおり契約（以下「本契約」という。）を締結する。</w:t>
+        <w:t>テンフィールズファーム株式会社（以下「甲」という。）とテンフィールズファクトリー株式会社（以下「乙」という。）は、甲が必要とする物品の調達に関し、乙が甲の依頼に基づき甲のために当該物品の購入を代行することについて、次のとおり契約（以下「本契約」という。）を締結する。</w:t>
       </w:r>
     </w:p>
     <w:p>
@@ -442,7 +442,7 @@
         <w:rPr>
           <w:b w:val="0"/>
         </w:rPr>
-        <w:t>所在地：【                                        】</w:t>
+        <w:t>所在地：三重県いなべ市大安町南金井2804 ラフィネ大安B205</w:t>
       </w:r>
     </w:p>
     <w:p>
@@ -453,7 +453,7 @@
         <w:rPr>
           <w:b w:val="0"/>
         </w:rPr>
-        <w:t>名　称：10 Farm</w:t>
+        <w:t>名　称：テンフィールズファーム株式会社</w:t>
       </w:r>
     </w:p>
     <w:p>
@@ -464,7 +464,7 @@
         <w:rPr>
           <w:b w:val="0"/>
         </w:rPr>
-        <w:t>代表者：【                    】　　　　　　　　印</w:t>
+        <w:t>代表者：代表取締役　市川　裕　　　　　　　　印</w:t>
       </w:r>
     </w:p>
     <w:p>
@@ -490,7 +490,7 @@
         <w:rPr>
           <w:b w:val="0"/>
         </w:rPr>
-        <w:t>所在地：【                                        】</w:t>
+        <w:t>所在地：京都府相楽郡精華町光台1丁目7 けいはんなプラザラボ棟9F</w:t>
       </w:r>
     </w:p>
     <w:p>
@@ -501,7 +501,7 @@
         <w:rPr>
           <w:b w:val="0"/>
         </w:rPr>
-        <w:t>名　称：株式会社10FF</w:t>
+        <w:t>名　称：テンフィールズファクトリー株式会社</w:t>
       </w:r>
     </w:p>
     <w:p>
@@ -512,7 +512,7 @@
         <w:rPr>
           <w:b w:val="0"/>
         </w:rPr>
-        <w:t>代表者：【                    】　　　　　　　　印</w:t>
+        <w:t>代表者：代表取締役　市川　裕　　　　　　　　印</w:t>
       </w:r>
     </w:p>
     <w:p>
@@ -547,7 +547,7 @@
         <w:rPr>
           <w:b w:val="0"/>
         </w:rPr>
-        <w:t>（委託者：10 Farm　／　受託者：株式会社10FF）</w:t>
+        <w:t>（委託者：テンフィールズファーム株式会社　／　受託者：テンフィールズファクトリー株式会社）</w:t>
       </w:r>
     </w:p>
     <w:p>

</xml_diff>